<commit_message>
fix: resolve student attendance logic errors and fix TMT parsing from excel with non-breaking spaces
</commit_message>
<xml_diff>
--- a/public/templates/sk-tendik-template.docx
+++ b/public/templates/sk-tendik-template.docx
@@ -206,17 +206,7 @@
           <w:sz w:val="20"/>
           <w:szCs w:val="20"/>
         </w:rPr>
-        <w:t xml:space="preserve">PENGANGKATAN GURU </w:t>
-      </w:r>
-      <w:r>
-        <w:rPr>
-          <w:rFonts w:ascii="Arial Narrow" w:hAnsi="Arial Narrow" w:cs="Times New Roman"/>
-          <w:b/>
-          <w:sz w:val="20"/>
-          <w:szCs w:val="20"/>
-          <w:lang w:val="en-US"/>
-        </w:rPr>
-        <w:t xml:space="preserve">TIDAK </w:t>
+        <w:t xml:space="preserve">PENGANGKATAN </w:t>
       </w:r>
       <w:r>
         <w:rPr>
@@ -225,7 +215,7 @@
           <w:sz w:val="20"/>
           <w:szCs w:val="20"/>
         </w:rPr>
-        <w:t>TETAP</w:t>
+        <w:t>TENAGA KEPENDIDIKAN</w:t>
       </w:r>
     </w:p>
     <w:p>
@@ -5571,7 +5561,6 @@
       </w:rPr>
       <w:t xml:space="preserve"> I/36 </w:t>
     </w:r>
-    <w:proofErr w:type="spellStart"/>
     <w:r>
       <w:rPr>
         <w:rFonts w:ascii="Arial Narrow" w:hAnsi="Arial Narrow"/>
@@ -5580,40 +5569,7 @@
         <w:szCs w:val="20"/>
         <w:lang w:val="en-US"/>
       </w:rPr>
-      <w:t>Kel.Sidanegara</w:t>
-    </w:r>
-    <w:proofErr w:type="spellEnd"/>
-    <w:r>
-      <w:rPr>
-        <w:rFonts w:ascii="Arial Narrow" w:hAnsi="Arial Narrow"/>
-        <w:color w:val="000000" w:themeColor="text1"/>
-        <w:sz w:val="20"/>
-        <w:szCs w:val="20"/>
-        <w:lang w:val="en-US"/>
-      </w:rPr>
-      <w:t xml:space="preserve"> </w:t>
-    </w:r>
-    <w:proofErr w:type="spellStart"/>
-    <w:r>
-      <w:rPr>
-        <w:rFonts w:ascii="Arial Narrow" w:hAnsi="Arial Narrow"/>
-        <w:color w:val="000000" w:themeColor="text1"/>
-        <w:sz w:val="20"/>
-        <w:szCs w:val="20"/>
-        <w:lang w:val="en-US"/>
-      </w:rPr>
-      <w:t>Kec</w:t>
-    </w:r>
-    <w:proofErr w:type="spellEnd"/>
-    <w:r>
-      <w:rPr>
-        <w:rFonts w:ascii="Arial Narrow" w:hAnsi="Arial Narrow"/>
-        <w:color w:val="000000" w:themeColor="text1"/>
-        <w:sz w:val="20"/>
-        <w:szCs w:val="20"/>
-        <w:lang w:val="en-US"/>
-      </w:rPr>
-      <w:t>. C</w:t>
+      <w:t>Kel.Sidanegara Kec. C</w:t>
     </w:r>
     <w:r>
       <w:rPr>
@@ -5632,29 +5588,7 @@
         <w:szCs w:val="20"/>
         <w:lang w:val="en-US"/>
       </w:rPr>
-      <w:t xml:space="preserve"> Tengah </w:t>
-    </w:r>
-    <w:proofErr w:type="spellStart"/>
-    <w:r>
-      <w:rPr>
-        <w:rFonts w:ascii="Arial Narrow" w:hAnsi="Arial Narrow"/>
-        <w:color w:val="000000" w:themeColor="text1"/>
-        <w:sz w:val="20"/>
-        <w:szCs w:val="20"/>
-        <w:lang w:val="en-US"/>
-      </w:rPr>
-      <w:t>kab</w:t>
-    </w:r>
-    <w:proofErr w:type="spellEnd"/>
-    <w:r>
-      <w:rPr>
-        <w:rFonts w:ascii="Arial Narrow" w:hAnsi="Arial Narrow"/>
-        <w:color w:val="000000" w:themeColor="text1"/>
-        <w:sz w:val="20"/>
-        <w:szCs w:val="20"/>
-        <w:lang w:val="en-US"/>
-      </w:rPr>
-      <w:t>. Cilacap</w:t>
+      <w:t xml:space="preserve"> Tengah kab. Cilacap</w:t>
     </w:r>
     <w:r>
       <w:rPr>
@@ -5934,51 +5868,7 @@
         <w:szCs w:val="20"/>
         <w:lang w:val="en-US"/>
       </w:rPr>
-      <w:t xml:space="preserve">P </w:t>
-    </w:r>
-    <w:proofErr w:type="spellStart"/>
-    <w:r>
-      <w:rPr>
-        <w:rFonts w:ascii="Arial Narrow" w:hAnsi="Arial Narrow"/>
-        <w:color w:val="000000" w:themeColor="text1"/>
-        <w:sz w:val="20"/>
-        <w:szCs w:val="20"/>
-        <w:lang w:val="en-US"/>
-      </w:rPr>
-      <w:t>Ma’arif</w:t>
-    </w:r>
-    <w:proofErr w:type="spellEnd"/>
-    <w:r>
-      <w:rPr>
-        <w:rFonts w:ascii="Arial Narrow" w:hAnsi="Arial Narrow"/>
-        <w:color w:val="000000" w:themeColor="text1"/>
-        <w:sz w:val="20"/>
-        <w:szCs w:val="20"/>
-        <w:lang w:val="en-US"/>
-      </w:rPr>
-      <w:t xml:space="preserve"> NU Cilacap               </w:t>
-    </w:r>
-    <w:proofErr w:type="spellStart"/>
-    <w:r>
-      <w:rPr>
-        <w:rFonts w:ascii="Arial Narrow" w:hAnsi="Arial Narrow"/>
-        <w:color w:val="000000" w:themeColor="text1"/>
-        <w:sz w:val="20"/>
-        <w:szCs w:val="20"/>
-        <w:lang w:val="en-US"/>
-      </w:rPr>
-      <w:t>Ma’arif</w:t>
-    </w:r>
-    <w:proofErr w:type="spellEnd"/>
-    <w:r>
-      <w:rPr>
-        <w:rFonts w:ascii="Arial Narrow" w:hAnsi="Arial Narrow"/>
-        <w:color w:val="000000" w:themeColor="text1"/>
-        <w:sz w:val="20"/>
-        <w:szCs w:val="20"/>
-        <w:lang w:val="en-US"/>
-      </w:rPr>
-      <w:t xml:space="preserve"> NU Cilacap</w:t>
+      <w:t>P Ma’arif NU Cilacap               Ma’arif NU Cilacap</w:t>
     </w:r>
   </w:p>
   <w:p>

</xml_diff>